<commit_message>
Se actualizo el documento de reglas SCM y se agrego el cronograma de clases
</commit_message>
<xml_diff>
--- a/01_Gestion de configuracion/DOC_Reglas_SCM_v1.docx
+++ b/01_Gestion de configuracion/DOC_Reglas_SCM_v1.docx
@@ -1,6 +1,6 @@
 
 <file path=word/document.xml><?xml version="1.0" encoding="utf-8"?>
-<w:document xmlns:wpc="http://schemas.microsoft.com/office/word/2010/wordprocessingCanvas" xmlns:cx="http://schemas.microsoft.com/office/drawing/2014/chartex" xmlns:cx1="http://schemas.microsoft.com/office/drawing/2015/9/8/chartex" xmlns:cx2="http://schemas.microsoft.com/office/drawing/2015/10/21/chartex" xmlns:cx3="http://schemas.microsoft.com/office/drawing/2016/5/9/chartex" xmlns:cx4="http://schemas.microsoft.com/office/drawing/2016/5/10/chartex" xmlns:cx5="http://schemas.microsoft.com/office/drawing/2016/5/11/chartex" xmlns:cx6="http://schemas.microsoft.com/office/drawing/2016/5/12/chartex" xmlns:cx7="http://schemas.microsoft.com/office/drawing/2016/5/13/chartex" xmlns:cx8="http://schemas.microsoft.com/office/drawing/2016/5/14/chartex" xmlns:mc="http://schemas.openxmlformats.org/markup-compatibility/2006" xmlns:aink="http://schemas.microsoft.com/office/drawing/2016/ink" xmlns:am3d="http://schemas.microsoft.com/office/drawing/2017/model3d" xmlns:o="urn:schemas-microsoft-com:office:office" xmlns:oel="http://schemas.microsoft.com/office/2019/extlst" xmlns:r="http://schemas.openxmlformats.org/officeDocument/2006/relationships" xmlns:m="http://schemas.openxmlformats.org/officeDocument/2006/math" xmlns:v="urn:schemas-microsoft-com:vml" xmlns:wp14="http://schemas.microsoft.com/office/word/2010/wordprocessingDrawing" xmlns:wp="http://schemas.openxmlformats.org/drawingml/2006/wordprocessingDrawing" xmlns:w10="urn:schemas-microsoft-com:office:word" xmlns:w="http://schemas.openxmlformats.org/wordprocessingml/2006/main" xmlns:w14="http://schemas.microsoft.com/office/word/2010/wordml" xmlns:w15="http://schemas.microsoft.com/office/word/2012/wordml" xmlns:w16cex="http://schemas.microsoft.com/office/word/2018/wordml/cex" xmlns:w16cid="http://schemas.microsoft.com/office/word/2016/wordml/cid" xmlns:w16="http://schemas.microsoft.com/office/word/2018/wordml" xmlns:w16sdtdh="http://schemas.microsoft.com/office/word/2020/wordml/sdtdatahash" xmlns:w16se="http://schemas.microsoft.com/office/word/2015/wordml/symex" xmlns:wpg="http://schemas.microsoft.com/office/word/2010/wordprocessingGroup" xmlns:wpi="http://schemas.microsoft.com/office/word/2010/wordprocessingInk" xmlns:wne="http://schemas.microsoft.com/office/word/2006/wordml" xmlns:wps="http://schemas.microsoft.com/office/word/2010/wordprocessingShape" mc:Ignorable="w14 w15 w16se w16cid w16 w16cex w16sdtdh wp14">
+<w:document xmlns:wpc="http://schemas.microsoft.com/office/word/2010/wordprocessingCanvas" xmlns:cx="http://schemas.microsoft.com/office/drawing/2014/chartex" xmlns:cx1="http://schemas.microsoft.com/office/drawing/2015/9/8/chartex" xmlns:cx2="http://schemas.microsoft.com/office/drawing/2015/10/21/chartex" xmlns:cx3="http://schemas.microsoft.com/office/drawing/2016/5/9/chartex" xmlns:cx4="http://schemas.microsoft.com/office/drawing/2016/5/10/chartex" xmlns:cx5="http://schemas.microsoft.com/office/drawing/2016/5/11/chartex" xmlns:cx6="http://schemas.microsoft.com/office/drawing/2016/5/12/chartex" xmlns:cx7="http://schemas.microsoft.com/office/drawing/2016/5/13/chartex" xmlns:cx8="http://schemas.microsoft.com/office/drawing/2016/5/14/chartex" xmlns:mc="http://schemas.openxmlformats.org/markup-compatibility/2006" xmlns:aink="http://schemas.microsoft.com/office/drawing/2016/ink" xmlns:am3d="http://schemas.microsoft.com/office/drawing/2017/model3d" xmlns:o="urn:schemas-microsoft-com:office:office" xmlns:oel="http://schemas.microsoft.com/office/2019/extlst" xmlns:r="http://schemas.openxmlformats.org/officeDocument/2006/relationships" xmlns:m="http://schemas.openxmlformats.org/officeDocument/2006/math" xmlns:v="urn:schemas-microsoft-com:vml" xmlns:wp14="http://schemas.microsoft.com/office/word/2010/wordprocessingDrawing" xmlns:wp="http://schemas.openxmlformats.org/drawingml/2006/wordprocessingDrawing" xmlns:w10="urn:schemas-microsoft-com:office:word" xmlns:w="http://schemas.openxmlformats.org/wordprocessingml/2006/main" xmlns:w14="http://schemas.microsoft.com/office/word/2010/wordml" xmlns:w15="http://schemas.microsoft.com/office/word/2012/wordml" xmlns:w16cex="http://schemas.microsoft.com/office/word/2018/wordml/cex" xmlns:w16cid="http://schemas.microsoft.com/office/word/2016/wordml/cid" xmlns:w16="http://schemas.microsoft.com/office/word/2018/wordml" xmlns:w16du="http://schemas.microsoft.com/office/word/2023/wordml/word16du" xmlns:w16sdtdh="http://schemas.microsoft.com/office/word/2020/wordml/sdtdatahash" xmlns:w16sdtfl="http://schemas.microsoft.com/office/word/2024/wordml/sdtformatlock" xmlns:w16se="http://schemas.microsoft.com/office/word/2015/wordml/symex" xmlns:wpg="http://schemas.microsoft.com/office/word/2010/wordprocessingGroup" xmlns:wpi="http://schemas.microsoft.com/office/word/2010/wordprocessingInk" xmlns:wne="http://schemas.microsoft.com/office/word/2006/wordml" xmlns:wps="http://schemas.microsoft.com/office/word/2010/wordprocessingShape" mc:Ignorable="w14 w15 w16se w16cid w16 w16cex w16sdtdh w16sdtfl w16du wp14">
   <w:body>
     <w:p>
       <w:pPr>
@@ -325,15 +325,7 @@
       </w:r>
       <w:proofErr w:type="spellEnd"/>
       <w:r>
-        <w:t xml:space="preserve"> </w:t>
-      </w:r>
-      <w:proofErr w:type="spellStart"/>
-      <w:r>
-        <w:t>Contarino</w:t>
-      </w:r>
-      <w:proofErr w:type="spellEnd"/>
-      <w:r>
-        <w:t xml:space="preserve">, Nicolas </w:t>
+        <w:t xml:space="preserve"> Contarino, Nicolas </w:t>
       </w:r>
     </w:p>
     <w:p>
@@ -374,14 +366,26 @@
     </w:p>
     <w:p>
       <w:pPr>
-        <w:rPr>
-          <w:lang w:val="es"/>
-        </w:rPr>
-      </w:pPr>
+        <w:pStyle w:val="Prrafodelista"/>
+        <w:numPr>
+          <w:ilvl w:val="0"/>
+          <w:numId w:val="3"/>
+        </w:numPr>
+      </w:pPr>
+      <w:r>
+        <w:t>90344 – Berecibar, Pedro Oscar</w:t>
+      </w:r>
     </w:p>
     <w:p>
       <w:pPr>
         <w:rPr>
+          <w:lang w:val="es"/>
+        </w:rPr>
+      </w:pPr>
+    </w:p>
+    <w:p>
+      <w:pPr>
+        <w:rPr>
           <w:lang w:val="es-ES"/>
         </w:rPr>
       </w:pPr>
@@ -389,7 +393,6 @@
         <w:rPr>
           <w:lang w:val="es-ES"/>
         </w:rPr>
-        <w:lastRenderedPageBreak/>
         <w:t>Estructura Repositorio</w:t>
       </w:r>
     </w:p>
@@ -520,7 +523,6 @@
         <w:rPr>
           <w:lang w:val="es-ES"/>
         </w:rPr>
-        <w:lastRenderedPageBreak/>
         <w:t>Tabla de Ítems de Configuración</w:t>
       </w:r>
     </w:p>
@@ -1999,13 +2001,7 @@
               <w:rPr>
                 <w:lang w:val="es-ES"/>
               </w:rPr>
-              <w:t>/04_Materiales Adicionales/</w:t>
-            </w:r>
-            <w:r>
-              <w:rPr>
-                <w:lang w:val="es-ES"/>
-              </w:rPr>
-              <w:t>Material de apoyo</w:t>
+              <w:t>/04_Materiales Adicionales/Material de apoyo</w:t>
             </w:r>
           </w:p>
         </w:tc>
@@ -2490,7 +2486,7 @@
 </file>
 
 <file path=word/numbering.xml><?xml version="1.0" encoding="utf-8"?>
-<w:numbering xmlns:wpc="http://schemas.microsoft.com/office/word/2010/wordprocessingCanvas" xmlns:cx="http://schemas.microsoft.com/office/drawing/2014/chartex" xmlns:cx1="http://schemas.microsoft.com/office/drawing/2015/9/8/chartex" xmlns:cx2="http://schemas.microsoft.com/office/drawing/2015/10/21/chartex" xmlns:cx3="http://schemas.microsoft.com/office/drawing/2016/5/9/chartex" xmlns:cx4="http://schemas.microsoft.com/office/drawing/2016/5/10/chartex" xmlns:cx5="http://schemas.microsoft.com/office/drawing/2016/5/11/chartex" xmlns:cx6="http://schemas.microsoft.com/office/drawing/2016/5/12/chartex" xmlns:cx7="http://schemas.microsoft.com/office/drawing/2016/5/13/chartex" xmlns:cx8="http://schemas.microsoft.com/office/drawing/2016/5/14/chartex" xmlns:mc="http://schemas.openxmlformats.org/markup-compatibility/2006" xmlns:aink="http://schemas.microsoft.com/office/drawing/2016/ink" xmlns:am3d="http://schemas.microsoft.com/office/drawing/2017/model3d" xmlns:o="urn:schemas-microsoft-com:office:office" xmlns:oel="http://schemas.microsoft.com/office/2019/extlst" xmlns:r="http://schemas.openxmlformats.org/officeDocument/2006/relationships" xmlns:m="http://schemas.openxmlformats.org/officeDocument/2006/math" xmlns:v="urn:schemas-microsoft-com:vml" xmlns:wp14="http://schemas.microsoft.com/office/word/2010/wordprocessingDrawing" xmlns:wp="http://schemas.openxmlformats.org/drawingml/2006/wordprocessingDrawing" xmlns:w10="urn:schemas-microsoft-com:office:word" xmlns:w="http://schemas.openxmlformats.org/wordprocessingml/2006/main" xmlns:w14="http://schemas.microsoft.com/office/word/2010/wordml" xmlns:w15="http://schemas.microsoft.com/office/word/2012/wordml" xmlns:w16cex="http://schemas.microsoft.com/office/word/2018/wordml/cex" xmlns:w16cid="http://schemas.microsoft.com/office/word/2016/wordml/cid" xmlns:w16="http://schemas.microsoft.com/office/word/2018/wordml" xmlns:w16sdtdh="http://schemas.microsoft.com/office/word/2020/wordml/sdtdatahash" xmlns:w16se="http://schemas.microsoft.com/office/word/2015/wordml/symex" xmlns:wpg="http://schemas.microsoft.com/office/word/2010/wordprocessingGroup" xmlns:wpi="http://schemas.microsoft.com/office/word/2010/wordprocessingInk" xmlns:wne="http://schemas.microsoft.com/office/word/2006/wordml" xmlns:wps="http://schemas.microsoft.com/office/word/2010/wordprocessingShape" mc:Ignorable="w14 w15 w16se w16cid w16 w16cex w16sdtdh wp14">
+<w:numbering xmlns:wpc="http://schemas.microsoft.com/office/word/2010/wordprocessingCanvas" xmlns:cx="http://schemas.microsoft.com/office/drawing/2014/chartex" xmlns:cx1="http://schemas.microsoft.com/office/drawing/2015/9/8/chartex" xmlns:cx2="http://schemas.microsoft.com/office/drawing/2015/10/21/chartex" xmlns:cx3="http://schemas.microsoft.com/office/drawing/2016/5/9/chartex" xmlns:cx4="http://schemas.microsoft.com/office/drawing/2016/5/10/chartex" xmlns:cx5="http://schemas.microsoft.com/office/drawing/2016/5/11/chartex" xmlns:cx6="http://schemas.microsoft.com/office/drawing/2016/5/12/chartex" xmlns:cx7="http://schemas.microsoft.com/office/drawing/2016/5/13/chartex" xmlns:cx8="http://schemas.microsoft.com/office/drawing/2016/5/14/chartex" xmlns:mc="http://schemas.openxmlformats.org/markup-compatibility/2006" xmlns:aink="http://schemas.microsoft.com/office/drawing/2016/ink" xmlns:am3d="http://schemas.microsoft.com/office/drawing/2017/model3d" xmlns:o="urn:schemas-microsoft-com:office:office" xmlns:oel="http://schemas.microsoft.com/office/2019/extlst" xmlns:r="http://schemas.openxmlformats.org/officeDocument/2006/relationships" xmlns:m="http://schemas.openxmlformats.org/officeDocument/2006/math" xmlns:v="urn:schemas-microsoft-com:vml" xmlns:wp14="http://schemas.microsoft.com/office/word/2010/wordprocessingDrawing" xmlns:wp="http://schemas.openxmlformats.org/drawingml/2006/wordprocessingDrawing" xmlns:w10="urn:schemas-microsoft-com:office:word" xmlns:w="http://schemas.openxmlformats.org/wordprocessingml/2006/main" xmlns:w14="http://schemas.microsoft.com/office/word/2010/wordml" xmlns:w15="http://schemas.microsoft.com/office/word/2012/wordml" xmlns:w16cex="http://schemas.microsoft.com/office/word/2018/wordml/cex" xmlns:w16cid="http://schemas.microsoft.com/office/word/2016/wordml/cid" xmlns:w16="http://schemas.microsoft.com/office/word/2018/wordml" xmlns:w16du="http://schemas.microsoft.com/office/word/2023/wordml/word16du" xmlns:w16sdtdh="http://schemas.microsoft.com/office/word/2020/wordml/sdtdatahash" xmlns:w16sdtfl="http://schemas.microsoft.com/office/word/2024/wordml/sdtformatlock" xmlns:w16se="http://schemas.microsoft.com/office/word/2015/wordml/symex" xmlns:wpg="http://schemas.microsoft.com/office/word/2010/wordprocessingGroup" xmlns:wpi="http://schemas.microsoft.com/office/word/2010/wordprocessingInk" xmlns:wne="http://schemas.microsoft.com/office/word/2006/wordml" xmlns:wps="http://schemas.microsoft.com/office/word/2010/wordprocessingShape" mc:Ignorable="w14 w15 w16se w16cid w16 w16cex w16sdtdh w16sdtfl w16du wp14">
   <w:abstractNum w:abstractNumId="0" w15:restartNumberingAfterBreak="0">
     <w:nsid w:val="2BF87154"/>
     <w:multiLevelType w:val="multilevel"/>
@@ -2757,7 +2753,7 @@
 </file>
 
 <file path=word/styles.xml><?xml version="1.0" encoding="utf-8"?>
-<w:styles xmlns:mc="http://schemas.openxmlformats.org/markup-compatibility/2006" xmlns:r="http://schemas.openxmlformats.org/officeDocument/2006/relationships" xmlns:w="http://schemas.openxmlformats.org/wordprocessingml/2006/main" xmlns:w14="http://schemas.microsoft.com/office/word/2010/wordml" xmlns:w15="http://schemas.microsoft.com/office/word/2012/wordml" xmlns:w16cex="http://schemas.microsoft.com/office/word/2018/wordml/cex" xmlns:w16cid="http://schemas.microsoft.com/office/word/2016/wordml/cid" xmlns:w16="http://schemas.microsoft.com/office/word/2018/wordml" xmlns:w16sdtdh="http://schemas.microsoft.com/office/word/2020/wordml/sdtdatahash" xmlns:w16se="http://schemas.microsoft.com/office/word/2015/wordml/symex" mc:Ignorable="w14 w15 w16se w16cid w16 w16cex w16sdtdh">
+<w:styles xmlns:mc="http://schemas.openxmlformats.org/markup-compatibility/2006" xmlns:r="http://schemas.openxmlformats.org/officeDocument/2006/relationships" xmlns:w="http://schemas.openxmlformats.org/wordprocessingml/2006/main" xmlns:w14="http://schemas.microsoft.com/office/word/2010/wordml" xmlns:w15="http://schemas.microsoft.com/office/word/2012/wordml" xmlns:w16cex="http://schemas.microsoft.com/office/word/2018/wordml/cex" xmlns:w16cid="http://schemas.microsoft.com/office/word/2016/wordml/cid" xmlns:w16="http://schemas.microsoft.com/office/word/2018/wordml" xmlns:w16du="http://schemas.microsoft.com/office/word/2023/wordml/word16du" xmlns:w16sdtdh="http://schemas.microsoft.com/office/word/2020/wordml/sdtdatahash" xmlns:w16sdtfl="http://schemas.microsoft.com/office/word/2024/wordml/sdtformatlock" xmlns:w16se="http://schemas.microsoft.com/office/word/2015/wordml/symex" mc:Ignorable="w14 w15 w16se w16cid w16 w16cex w16sdtdh w16sdtfl w16du">
   <w:docDefaults>
     <w:rPrDefault>
       <w:rPr>

</xml_diff>

<commit_message>
docs(scm): agregar a Masino, Nicolás a la lista de integrantes
</commit_message>
<xml_diff>
--- a/01_Gestion de configuracion/DOC_Reglas_SCM_v1.docx
+++ b/01_Gestion de configuracion/DOC_Reglas_SCM_v1.docx
@@ -374,6 +374,18 @@
       </w:pPr>
       <w:r>
         <w:t>90344 – Berecibar, Pedro Oscar</w:t>
+      </w:r>
+    </w:p>
+    <w:p>
+      <w:pPr>
+        <w:pStyle w:val="Prrafodelista"/>
+        <w:numPr>
+          <w:ilvl w:val="0"/>
+          <w:numId w:val="3"/>
+        </w:numPr>
+      </w:pPr>
+      <w:r>
+        <w:t>89799 – Masino, Nicolás</w:t>
       </w:r>
     </w:p>
     <w:p>

</xml_diff>

<commit_message>
docs(scm): agregar los TIG a la tabla de ítems de configuración
</commit_message>
<xml_diff>
--- a/01_Gestion de configuracion/DOC_Reglas_SCM_v1.docx
+++ b/01_Gestion de configuracion/DOC_Reglas_SCM_v1.docx
@@ -1458,6 +1458,135 @@
                 <w:lang w:val="es-ES"/>
               </w:rPr>
               <w:t>Practico</w:t>
+            </w:r>
+          </w:p>
+        </w:tc>
+      </w:tr>
+      <w:tr>
+        <w:trPr>
+          <w:trHeight w:val="745"/>
+        </w:trPr>
+        <w:tc>
+          <w:tcPr>
+            <w:tcW w:w="2235" w:type="dxa"/>
+            <w:tcBorders>
+              <w:top w:val="single" w:sz="8" w:space="0" w:color="000000"/>
+              <w:left w:val="single" w:sz="8" w:space="0" w:color="000000"/>
+              <w:bottom w:val="single" w:sz="8" w:space="0" w:color="000000"/>
+              <w:right w:val="single" w:sz="8" w:space="0" w:color="000000"/>
+            </w:tcBorders>
+            <w:tcMar>
+              <w:top w:w="100" w:type="dxa"/>
+              <w:left w:w="100" w:type="dxa"/>
+              <w:bottom w:w="100" w:type="dxa"/>
+              <w:right w:w="100" w:type="dxa"/>
+            </w:tcMar>
+            <w:hideMark/>
+          </w:tcPr>
+          <w:p>
+            <w:pPr>
+              <w:rPr>
+                <w:lang w:val="es-ES"/>
+              </w:rPr>
+            </w:pPr>
+            <w:r>
+              <w:rPr>
+                <w:lang w:val="es-ES"/>
+              </w:rPr>
+              <w:t xml:space="preserve">Trabajo de Investigación Grupal (TIG)</w:t>
+            </w:r>
+          </w:p>
+        </w:tc>
+        <w:tc>
+          <w:tcPr>
+            <w:tcW w:w="2433" w:type="dxa"/>
+            <w:tcBorders>
+              <w:top w:val="single" w:sz="8" w:space="0" w:color="000000"/>
+              <w:left w:val="single" w:sz="8" w:space="0" w:color="000000"/>
+              <w:bottom w:val="single" w:sz="8" w:space="0" w:color="000000"/>
+              <w:right w:val="single" w:sz="8" w:space="0" w:color="000000"/>
+            </w:tcBorders>
+            <w:tcMar>
+              <w:top w:w="100" w:type="dxa"/>
+              <w:left w:w="100" w:type="dxa"/>
+              <w:bottom w:w="100" w:type="dxa"/>
+              <w:right w:w="100" w:type="dxa"/>
+            </w:tcMar>
+            <w:hideMark/>
+          </w:tcPr>
+          <w:p>
+            <w:pPr>
+              <w:rPr>
+                <w:lang w:val="es-ES"/>
+              </w:rPr>
+            </w:pPr>
+            <w:r>
+              <w:rPr>
+                <w:lang w:val="es-ES"/>
+              </w:rPr>
+              <w:t xml:space="preserve">TIG_&lt;N°_Nombre&gt;.&lt;extension&gt;</w:t>
+            </w:r>
+          </w:p>
+        </w:tc>
+        <w:tc>
+          <w:tcPr>
+            <w:tcW w:w="2082" w:type="dxa"/>
+            <w:tcBorders>
+              <w:top w:val="single" w:sz="8" w:space="0" w:color="000000"/>
+              <w:left w:val="single" w:sz="8" w:space="0" w:color="000000"/>
+              <w:bottom w:val="single" w:sz="8" w:space="0" w:color="000000"/>
+              <w:right w:val="single" w:sz="8" w:space="0" w:color="000000"/>
+            </w:tcBorders>
+            <w:tcMar>
+              <w:top w:w="100" w:type="dxa"/>
+              <w:left w:w="100" w:type="dxa"/>
+              <w:bottom w:w="100" w:type="dxa"/>
+              <w:right w:w="100" w:type="dxa"/>
+            </w:tcMar>
+            <w:hideMark/>
+          </w:tcPr>
+          <w:p>
+            <w:pPr>
+              <w:rPr>
+                <w:lang w:val="es-ES"/>
+              </w:rPr>
+            </w:pPr>
+            <w:r>
+              <w:rPr>
+                <w:lang w:val="es-ES"/>
+              </w:rPr>
+              <w:t xml:space="preserve">/02_Practico/Investigaciones_Grupales/TIG_&lt;N°_Nombre&gt;/</w:t>
+            </w:r>
+          </w:p>
+        </w:tc>
+        <w:tc>
+          <w:tcPr>
+            <w:tcW w:w="2190" w:type="dxa"/>
+            <w:tcBorders>
+              <w:top w:val="single" w:sz="8" w:space="0" w:color="000000"/>
+              <w:left w:val="single" w:sz="8" w:space="0" w:color="000000"/>
+              <w:bottom w:val="single" w:sz="8" w:space="0" w:color="000000"/>
+              <w:right w:val="single" w:sz="8" w:space="0" w:color="000000"/>
+            </w:tcBorders>
+            <w:tcMar>
+              <w:top w:w="100" w:type="dxa"/>
+              <w:left w:w="100" w:type="dxa"/>
+              <w:bottom w:w="100" w:type="dxa"/>
+              <w:right w:w="100" w:type="dxa"/>
+            </w:tcMar>
+            <w:hideMark/>
+          </w:tcPr>
+          <w:p>
+            <w:pPr>
+              <w:rPr>
+                <w:lang w:val="es-ES"/>
+              </w:rPr>
+            </w:pPr>
+            <w:r>
+              <w:rPr>
+                <w:lang w:val="es-ES"/>
+              </w:rPr>
+              <w:t xml:space="preserve">Practico</w:t>
             </w:r>
           </w:p>
         </w:tc>

</xml_diff>